<commit_message>
Align SCHM manuscript with supplementary reproduction (changelog), rebuild Word; update status
Co-Authored-By: Claude Opus 5.5 <noreply@anthropic.com>
Claude-Session: https://claude.ai/code/session_01LGLpDzAMfdMgWcXQjLxauw
</commit_message>
<xml_diff>
--- a/manuscript/schm/word/Manuscript_SCHM.docx
+++ b/manuscript/schm/word/Manuscript_SCHM.docx
@@ -11109,7 +11109,7 @@
         <w:t xml:space="preserve"> </w:t>
       </w:r>
       <w:r>
-        <w:t xml:space="preserve">the last three intervals use Simpson’s 3/8 rule. The end half-weights vanish only for a record that starts and ends at zero deflection, as in the laboratory but not on a bridge with residual deflection. Because the influence line of a continuous beam is piecewise cubic and twice differentiable, Simpson quadrature is nearly exact, whereas the trapezoidal rule converges only as</w:t>
+        <w:t xml:space="preserve">the last three intervals use Simpson’s 3/8 rule. The end half-weights vanish only for a record that starts and ends at zero deflection, as in the laboratory but not on a bridge with residual deflection. Because the influence line of a continuous beam is piecewise cubic and twice differentiable, Simpson quadrature is nearly exact for a single load, whereas the trapezoidal rule converges only as</w:t>
       </w:r>
       <w:r>
         <w:t xml:space="preserve"> </w:t>
@@ -11135,7 +11135,42 @@
         <w:t xml:space="preserve"> </w:t>
       </w:r>
       <w:r>
-        <w:t xml:space="preserve">(Section 3.2).</w:t>
+        <w:t xml:space="preserve">(Section 3.2). Each further axle, however, adds slope discontinuities where it enters and leaves the beam, and Simpson quadrature keeps this accuracy only when these kinks fall on panel edges; otherwise the trapezoidal rule with</w:t>
+      </w:r>
+      <w:r>
+        <w:t xml:space="preserve"> </w:t>
+      </w:r>
+      <m:oMath>
+        <m:r>
+          <m:t>Δ</m:t>
+        </m:r>
+        <m:r>
+          <m:t>x</m:t>
+        </m:r>
+        <m:r>
+          <m:rPr>
+            <m:sty m:val="p"/>
+          </m:rPr>
+          <m:t>≤</m:t>
+        </m:r>
+        <m:r>
+          <m:t>l</m:t>
+        </m:r>
+        <m:r>
+          <m:rPr>
+            <m:sty m:val="p"/>
+          </m:rPr>
+          <m:t>/</m:t>
+        </m:r>
+        <m:r>
+          <m:t>20</m:t>
+        </m:r>
+      </m:oMath>
+      <w:r>
+        <w:t xml:space="preserve"> </w:t>
+      </w:r>
+      <w:r>
+        <w:t xml:space="preserve">is the safer choice.</w:t>
       </w:r>
     </w:p>
     <w:p>
@@ -12786,7 +12821,7 @@
         <w:pStyle w:val="FirstParagraph"/>
       </w:pPr>
       <w:r>
-        <w:t xml:space="preserve">Fig. 5 compares the analytical influence line (Appendix A, Eq. (A.2)) with the measurements for the single load; the values are listed in Appendix C. The largest absolute deviation is 0.0125 mm, which is 0.43 % of the maximum deflection and two and a half times the LVDT resolution. The residuals are predominantly positive on both spans, which indicates a small systematic component, plausibly slight support flexibility or a small overestimate of</w:t>
+        <w:t xml:space="preserve">Fig. 5 compares the analytical influence line (Appendix A, Eq. (A.2)) with the measurements for the single load; the values are listed in Appendix C. The largest absolute deviation is 0.0126 mm, which is 0.44 % of the maximum deflection and two and a half times the LVDT resolution. The residuals are predominantly positive on both spans, which indicates a small systematic component, plausibly slight support flexibility or a small overestimate of</w:t>
       </w:r>
       <w:r>
         <w:t xml:space="preserve"> </w:t>
@@ -13193,7 +13228,7 @@
         <w:pStyle w:val="BodyText"/>
       </w:pPr>
       <w:r>
-        <w:t xml:space="preserve">In Table 3, the trapezoidal bias of −0.500 % is a property of the quadrature, not an experimental error, and it propagates one-for-one into BPM. Simpson quadrature on the same grid reduces it to +0.027 % at no experimental cost. The single-load record has 20 intervals; the two- and three-load records have 21 and 23, so Simpson quadrature there needs the 3/8 end panel of Section 2.4.</w:t>
+        <w:t xml:space="preserve">In Table 3, the trapezoidal bias of −0.500 % is a property of the quadrature, not an experimental error, and it propagates one-for-one into BPM. Simpson quadrature on the same grid reduces it to +0.027 % at no experimental cost. The single-load record has 20 intervals; the two- and three-load records have 21 and 23, so Simpson quadrature there needs the 3/8 end panel of Section 2.4. It then loses its advantage: on the analytical records its bias is −0.92 % for the two-load and −0.44 % for the three-load group, against −0.500 % for the trapezoidal rule, because the entry and exit kinks of the trailing loads fall inside Simpson panels.</w:t>
       </w:r>
     </w:p>
     <w:bookmarkEnd w:id="29"/>
@@ -18799,7 +18834,7 @@
         </m:r>
       </m:oMath>
       <w:r>
-        <w:t xml:space="preserve">; at a spacing of 300 mm the bias would be −0.110 %, at 375 mm +0.249 %, and the residual would reach 0.4–0.75 %. The zero-offset term never cancels fully, even for equal offsets, because the sensitivity</w:t>
+        <w:t xml:space="preserve">; for the two-load group at a spacing of 300 mm the bias would be −0.171 %, at 375 mm +0.014 %, and the residual would reach 0.33 and 0.51 percentage points. The zero-offset term never cancels fully, even for equal offsets, because the sensitivity</w:t>
       </w:r>
       <w:r>
         <w:t xml:space="preserve"> </w:t>
@@ -21590,7 +21625,7 @@
         <w:t xml:space="preserve"> </w:t>
       </w:r>
       <w:r>
-        <w:t xml:space="preserve">from 0.6 to 120, and Table 9 its envelope.</w:t>
+        <w:t xml:space="preserve">from 0.6 to 120, and Table 9 its envelope, taken from a denser sweep of 300 speeds so that it does not depend on the speed sampling.</w:t>
       </w:r>
     </w:p>
     <w:p>
@@ -21969,7 +22004,7 @@
               <w:jc w:val="left"/>
             </w:pPr>
             <w:r>
-              <w:t xml:space="preserve">3.8</w:t>
+              <w:t xml:space="preserve">4.1</w:t>
             </w:r>
           </w:p>
         </w:tc>
@@ -21983,7 +22018,7 @@
               <w:jc w:val="left"/>
             </w:pPr>
             <w:r>
-              <w:t xml:space="preserve">1.7</w:t>
+              <w:t xml:space="preserve">1.8</w:t>
             </w:r>
           </w:p>
         </w:tc>
@@ -21997,7 +22032,7 @@
               <w:jc w:val="left"/>
             </w:pPr>
             <w:r>
-              <w:t xml:space="preserve">1.00</w:t>
+              <w:t xml:space="preserve">0.99</w:t>
             </w:r>
           </w:p>
         </w:tc>
@@ -22011,7 +22046,7 @@
               <w:jc w:val="left"/>
             </w:pPr>
             <w:r>
-              <w:t xml:space="preserve">0.32</w:t>
+              <w:t xml:space="preserve">0.59</w:t>
             </w:r>
           </w:p>
         </w:tc>
@@ -22025,7 +22060,7 @@
               <w:jc w:val="left"/>
             </w:pPr>
             <w:r>
-              <w:t xml:space="preserve">0.15</w:t>
+              <w:t xml:space="preserve">0.23</w:t>
             </w:r>
           </w:p>
         </w:tc>
@@ -22039,7 +22074,7 @@
               <w:jc w:val="left"/>
             </w:pPr>
             <w:r>
-              <w:t xml:space="preserve">0.08</w:t>
+              <w:t xml:space="preserve">0.13</w:t>
             </w:r>
           </w:p>
         </w:tc>
@@ -22321,7 +22356,7 @@
                   <m:t>&lt;</m:t>
                 </m:r>
                 <m:r>
-                  <m:t>4</m:t>
+                  <m:t>4.2</m:t>
                 </m:r>
                 <m:r>
                   <m:t> </m:t>
@@ -22422,7 +22457,7 @@
         <w:t xml:space="preserve"> </w:t>
       </w:r>
       <w:r>
-        <w:t xml:space="preserve">the error exceeds 15 % and changes sign, and the estimator should not be used. The dominant mechanism is truncation: at high speed the beam has not returned to its datum when the load leaves (39 % of the static peak at</w:t>
+        <w:t xml:space="preserve">the error exceeds 15 % and changes sign, and the estimator should not be used. The dominant mechanism is truncation: at high speed the beam has not returned to its datum when the load leaves (34.5 % of the static peak, with opposite sign, at</w:t>
       </w:r>
       <w:r>
         <w:t xml:space="preserve"> </w:t>
@@ -22478,7 +22513,7 @@
         </m:r>
       </m:oMath>
       <w:r>
-        <w:t xml:space="preserve">). Extending the window by four fundamental periods roughly halves the error. The error is not a residue of free vibration that damping would remove: repeating the analysis with damping ratios from 0.5 % to 5 % changes it monotonically, and less damping gives less error. Invariance survives the dynamics approximately: for a fixed total load distributed over one, two and three axles with spacings of 0.5–1.5 m, the spread of the integrals is 0.33 % at</w:t>
+        <w:t xml:space="preserve">). Extending the window by four fundamental periods reduces the error by 20–28 %. The error is not a residue of free vibration that damping would remove: repeating the analysis with damping ratios from 0.5 % to 5 % changes it monotonically. Invariance survives the dynamics approximately: for a fixed total load carried by one axle or by two or three equal axles at spacings of 0.5, 1.0 or 1.5 m, the spread of the integrals is 0.23 % at</w:t>
       </w:r>
       <w:r>
         <w:t xml:space="preserve"> </w:t>
@@ -22537,7 +22572,7 @@
         <w:t xml:space="preserve"> </w:t>
       </w:r>
       <w:r>
-        <w:t xml:space="preserve">and 1.95 % at 3.0. Because the analysis omits the vehicle’s own suspension and road roughness, Eq. (21) is a necessary condition for real traffic, not a sufficient one. As an order-of-magnitude orientation only, plausible fundamental frequencies for individual spans of 10 to 30 m give</w:t>
+        <w:t xml:space="preserve">and 2.31 % at 3.0. Because the analysis omits the vehicle’s own suspension and road roughness, Eq. (21) is a necessary condition for real traffic, not a sufficient one. As an order-of-magnitude orientation only, plausible fundamental frequencies for individual spans of 10 to 30 m give</w:t>
       </w:r>
       <w:r>
         <w:t xml:space="preserve"> </w:t>
@@ -22628,7 +22663,7 @@
         <w:pStyle w:val="FirstParagraph"/>
       </w:pPr>
       <w:r>
-        <w:t xml:space="preserve">Table 10 assembles an indicative budget for the laboratory tests and for a plausible field deployment on a short-span concrete continuous bridge with a well-conditioned gauge. Following the GUM [47], known biases are corrected rather than budgeted: the trapezoidal bias is removed by Simpson quadrature. All remaining contributions are treated as independent standard uncertainties and combined by root-sum-square, with the same rule in every column. The field entries are engineering scenarios propagated through the sensitivities derived above, with environmental drift values from long-term monitoring [48,49]. They are not a metrological validation of a complete system. The Type A entries are upper bounds set by the transducer resolution and the Monte Carlo result of Section 6.3, not evaluations from the repeated cycles.</w:t>
+        <w:t xml:space="preserve">Table 10 assembles an indicative budget for the laboratory tests and for a plausible field deployment on a short-span concrete continuous bridge with a well-conditioned gauge. Following the GUM [47], known biases are corrected rather than budgeted: the trapezoidal bias is removed by Simpson quadrature or by fine sampling (Section 2.4). All remaining contributions are treated as independent standard uncertainties and combined by root-sum-square, with the same rule in every column. The field entries are engineering scenarios propagated through the sensitivities derived above, with environmental drift values from long-term monitoring [48,49]. They are not a metrological validation of a complete system. The Type A entries are upper bounds set by the transducer resolution and the Monte Carlo result of Section 6.3, not evaluations from the repeated cycles.</w:t>
       </w:r>
     </w:p>
     <w:p>
@@ -24765,7 +24800,7 @@
         <w:pStyle w:val="BodyText"/>
       </w:pPr>
       <w:r>
-        <w:t xml:space="preserve">Use Simpson quadrature, with a 3/8 end panel for an odd number of intervals, or a sampling interval of</w:t>
+        <w:t xml:space="preserve">Use Simpson quadrature, with a 3/8 end panel for an odd number of intervals, only when the entry and exit of every axle fall on panel edges; otherwise use the trapezoidal rule with a sampling interval of</w:t>
       </w:r>
       <w:r>
         <w:t xml:space="preserve"> </w:t>
@@ -28306,7 +28341,39 @@
         <w:t xml:space="preserve"> </w:t>
       </w:r>
       <w:r>
-        <w:t xml:space="preserve">= 0.0025 mm) and all three combined. Each realisation perturbed the measured record, recomputed the integral with the same rule and grid and re-identified the load. For SLM, an averaged (noise-free) reference and a single noisy reference were distinguished. Table B.1 gives the two-load results; the three-load case agrees within 0.1 percentage point. The bias column reflects the deviation of the measured record from weighing (Table 4) and is constant across error sources; the information is in the spread.</w:t>
+        <w:t xml:space="preserve">= 0.0025 mm) and all three combined. Each realisation perturbed the measured record, recomputed the integral with the same rule and grid and re-identified the load. For SLM, an averaged (noise-free) reference and a single noisy reference were distinguished. Table B.1 gives the two-load results. For the three-load case the bias is 0.08–0.09 percentage points higher and the standard deviations agree within 0.07 percentage points, except under zero offset alone, where the smaller offset sensitivity</w:t>
+      </w:r>
+      <w:r>
+        <w:t xml:space="preserve"> </w:t>
+      </w:r>
+      <m:oMath>
+        <m:r>
+          <m:t>L</m:t>
+        </m:r>
+        <m:r>
+          <m:rPr>
+            <m:sty m:val="p"/>
+          </m:rPr>
+          <m:t>/</m:t>
+        </m:r>
+        <m:sSub>
+          <m:e>
+            <m:r>
+              <m:t>I</m:t>
+            </m:r>
+          </m:e>
+          <m:sub>
+            <m:r>
+              <m:t>y</m:t>
+            </m:r>
+          </m:sub>
+        </m:sSub>
+      </m:oMath>
+      <w:r>
+        <w:t xml:space="preserve"> </w:t>
+      </w:r>
+      <w:r>
+        <w:t xml:space="preserve">lowers the standard deviation from 0.64 % to 0.37 % (BPM). The bias column reflects the deviation of the measured record from weighing (Table 4) and is constant across error sources; the information is in the spread.</w:t>
       </w:r>
     </w:p>
     <w:p>

</xml_diff>